<commit_message>
París: Postal del Cielo (VII) en inglés y español, revisiones del inglés, notas de método
- paris_back.tex: documento bilingüe del poema del día (inglés y español).
- Paris.tex: sección VII con «twenty-two» y «Took so long to learn»;
  correcciones previas (complicit, realising, the million other couples,
  why, yet / with a black hole, modern-art museum).
- Paris_es.tex: añadida la sección «Postal del Cielo» tras «Anciano en París»;
  «al mismo tiempo» y «y siempre nueva».
- CLAUDE.md: método de AGTOL; los endecasílabos dejan de ser obligatorios.
- revision_gramatical.md, docx de Anciano en París, imágenes de substack.

Co-Authored-By: Claude Fable 5.1 <noreply@anthropic.com>
Claude-Session: https://claude.ai/code/session_01V1AstvjDmjNg5jJDoLUwcJ
</commit_message>
<xml_diff>
--- a/Paris/Paris.docx
+++ b/Paris/Paris.docx
@@ -322,7 +322,7 @@
         <w:br/>
       </w:r>
       <w:r>
-        <w:t xml:space="preserve">and the city indulged us, complacent.</w:t>
+        <w:t xml:space="preserve">and the city indulged us, complicit.</w:t>
       </w:r>
       <w:r>
         <w:br/>
@@ -484,7 +484,7 @@
         <w:br/>
       </w:r>
       <w:r>
-        <w:t xml:space="preserve">madly in love, without realizing</w:t>
+        <w:t xml:space="preserve">madly in love, without realising</w:t>
       </w:r>
       <w:r>
         <w:br/>
@@ -560,7 +560,7 @@
         <w:br/>
       </w:r>
       <w:r>
-        <w:t xml:space="preserve">and yet no one realised. All the other million couples,</w:t>
+        <w:t xml:space="preserve">and yet no one realised. The million other couples,</w:t>
       </w:r>
       <w:r>
         <w:br/>
@@ -934,7 +934,7 @@
         <w:pStyle w:val="BodyText"/>
       </w:pPr>
       <w:r>
-        <w:t xml:space="preserve">What is it? It takes you a while to realise the reason.</w:t>
+        <w:t xml:space="preserve">What is it? It takes you a while to realise why.</w:t>
       </w:r>
       <w:r>
         <w:br/>
@@ -1078,7 +1078,7 @@
         <w:pStyle w:val="BodyText"/>
       </w:pPr>
       <w:r>
-        <w:t xml:space="preserve">Your daughter is twenty, still holds your hand,</w:t>
+        <w:t xml:space="preserve">Your daughter is twenty-two, still holds your hand,</w:t>
       </w:r>
       <w:r>
         <w:br/>
@@ -1202,21 +1202,21 @@
         <w:br/>
       </w:r>
       <w:r>
-        <w:t xml:space="preserve">as a king watching his prince being knighted, yet,</w:t>
-      </w:r>
-      <w:r>
-        <w:br/>
-      </w:r>
-      <w:r>
-        <w:t xml:space="preserve">a black hole eating your heart.</w:t>
-      </w:r>
-    </w:p>
-    <w:p>
-      <w:pPr>
-        <w:pStyle w:val="BodyText"/>
-      </w:pPr>
-      <w:r>
-        <w:t xml:space="preserve">Turns out,</w:t>
+        <w:t xml:space="preserve">as a king watching his prince being knighted, yet</w:t>
+      </w:r>
+      <w:r>
+        <w:br/>
+      </w:r>
+      <w:r>
+        <w:t xml:space="preserve">with a black hole eating your heart.</w:t>
+      </w:r>
+    </w:p>
+    <w:p>
+      <w:pPr>
+        <w:pStyle w:val="BodyText"/>
+      </w:pPr>
+      <w:r>
+        <w:t xml:space="preserve">Took so long to learn,</w:t>
       </w:r>
       <w:r>
         <w:br/>
@@ -1274,7 +1274,7 @@
         <w:pStyle w:val="BodyText"/>
       </w:pPr>
       <w:r>
-        <w:t xml:space="preserve">Turns out,</w:t>
+        <w:t xml:space="preserve">Took so long to learn,</w:t>
       </w:r>
       <w:r>
         <w:br/>
@@ -1606,7 +1606,7 @@
         <w:br/>
       </w:r>
       <w:r>
-        <w:t xml:space="preserve">spend on a ticket to the modernist museum</w:t>
+        <w:t xml:space="preserve">spend on a ticket to the modern-art museum</w:t>
       </w:r>
       <w:r>
         <w:br/>

</xml_diff>

<commit_message>
París: Goodbye to Paris / Adiós a París; retirar los md
- Paris.tex: el poema pasa a titularse Goodbye to Paris; revisión de la
  primera estrofa (pass beneath, and away) y de la estrofa de los hijos
  (squabbles, at dawn, their laughter), conservando el verso del tiempo.
- Paris_es.tex: se incorpora Adiós a París como sexto poema.
- substack: bilingüe del poema (goodbye_paris) y español suelto
  (goodbye_paris_es), con tex, pdf y docx.
- Se retiran todos los md de la serie y de substack; solo queda
  revision_gramatical.md.

Co-Authored-By: Claude Fable 5.1 <noreply@anthropic.com>
</commit_message>
<xml_diff>
--- a/Paris/Paris.docx
+++ b/Paris/Paris.docx
@@ -1296,13 +1296,13 @@
       </w:r>
     </w:p>
     <w:bookmarkEnd w:id="15"/>
-    <w:bookmarkStart w:id="16" w:name="paris-and-alexandria"/>
+    <w:bookmarkStart w:id="16" w:name="goodbye-to-paris"/>
     <w:p>
       <w:pPr>
         <w:pStyle w:val="Heading2"/>
       </w:pPr>
       <w:r>
-        <w:t xml:space="preserve">Paris and Alexandria</w:t>
+        <w:t xml:space="preserve">Goodbye to Paris</w:t>
       </w:r>
     </w:p>
     <w:p>
@@ -1334,7 +1334,7 @@
         <w:br/>
       </w:r>
       <w:r>
-        <w:t xml:space="preserve">pass under my window?</w:t>
+        <w:t xml:space="preserve">pass beneath, and away?</w:t>
       </w:r>
     </w:p>
     <w:p>
@@ -1392,7 +1392,13 @@
         <w:br/>
       </w:r>
       <w:r>
-        <w:t xml:space="preserve">each one identical to the others,</w:t>
+        <w:t xml:space="preserve">to the squabbles of my children,</w:t>
+      </w:r>
+      <w:r>
+        <w:br/>
+      </w:r>
+      <w:r>
+        <w:t xml:space="preserve">and the way they sneaked into our bed at dawn,</w:t>
       </w:r>
       <w:r>
         <w:br/>
@@ -1406,7 +1412,7 @@
         <w:pStyle w:val="BodyText"/>
       </w:pPr>
       <w:r>
-        <w:t xml:space="preserve">Shall I say goodbye to my children’s laughter,</w:t>
+        <w:t xml:space="preserve">Shall I say goodbye to their laughter,</w:t>
       </w:r>
       <w:r>
         <w:br/>

</xml_diff>